<commit_message>
docs: mark calibration finding 0.1 (polarity) as FIXED in the prep/handoff
The vulnerability-curve polarity inversion was hotfixed (1cc204d); the calibration
session now calibrates the curve SHAPE (linear vs convex), not the direction. Item 0.2
(dead USD path) still open. Re-rendered docx.

Co-Authored-By: Claude Opus 4.7 <noreply@anthropic.com>
</commit_message>
<xml_diff>
--- a/security_scanner/docs/Phishield_Calibration_Prep.docx
+++ b/security_scanner/docs/Phishield_Calibration_Prep.docx
@@ -38,7 +38,7 @@
           <w:color w:val="64748B"/>
           <w:sz w:val="19"/>
         </w:rPr>
-        <w:t>Sandbox proposals for the FIN-9 session - 2 correctness findings + 5 parameter groups - 2026-06-03</w:t>
+        <w:t>Sandbox proposals for the FIN-9 session - polarity fixed, shape to calibrate - 2026-06-03</w:t>
       </w:r>
     </w:p>
     <w:p/>
@@ -162,7 +162,7 @@
           <w:color w:val="0F2744"/>
           <w:sz w:val="22"/>
         </w:rPr>
-        <w:t>0.1 🔴 The vulnerability curve is POLARITY-INVERTED (regression from Wave 1)</w:t>
+        <w:t>0.1 ✅ The vulnerability curve was POLARITY-INVERTED — POLARITY FIXED 2026-06-03 (commit `1cc204d`); curve SHAPE still to calibrate</w:t>
       </w:r>
     </w:p>
     <w:p>
@@ -2750,10 +2750,38 @@
         <w:rPr>
           <w:b/>
         </w:rPr>
-        <w:t>Fix the two correctness items (0.1, 0.2)</w:t>
-      </w:r>
-      <w:r>
-        <w:t xml:space="preserve"> + re-baseline the verifier.</w:t>
+        <w:t>Item 0.1 (polarity) is already fixed</w:t>
+      </w:r>
+      <w:r>
+        <w:t xml:space="preserve"> (</w:t>
+      </w:r>
+      <w:r>
+        <w:rPr>
+          <w:rFonts w:ascii="Consolas" w:hAnsi="Consolas"/>
+          <w:sz w:val="18"/>
+        </w:rPr>
+        <w:t>1cc204d</w:t>
+      </w:r>
+      <w:r>
+        <w:t xml:space="preserve">, linear placeholder; verifier passed unchanged) — </w:t>
+      </w:r>
+      <w:r>
+        <w:rPr>
+          <w:b/>
+        </w:rPr>
+        <w:t>calibrate its SHAPE</w:t>
+      </w:r>
+      <w:r>
+        <w:t xml:space="preserve"> (linear vs convex k≈1.8) here. </w:t>
+      </w:r>
+      <w:r>
+        <w:rPr>
+          <w:b/>
+        </w:rPr>
+        <w:t>Fix item 0.2 (dead USD path)</w:t>
+      </w:r>
+      <w:r>
+        <w:t xml:space="preserve"> still to do.</w:t>
       </w:r>
     </w:p>
     <w:p>

</xml_diff>